<commit_message>
Diseño de templates implementado
</commit_message>
<xml_diff>
--- a/output/certificados/Campos.docx
+++ b/output/certificados/Campos.docx
@@ -3546,84 +3546,6 @@
           <w:shd w:fill="auto" w:val="clear"/>
           <w:vertAlign w:val="baseline"/>
         </w:rPr>
-      </w:r>
-    </w:p>
-    <w:p>
-      <w:pPr>
-        <w:ind w:left="0"/>
-      </w:pPr>
-      <w:r>
-        <w:drawing>
-          <wp:inline xmlns:a="http://schemas.openxmlformats.org/drawingml/2006/main">
-            <wp:extent cx="2286000" cy="2286000"/>
-            <wp:docPr id="1" name="Picture 1"/>
-            <wp:cNvGraphicFramePr>
-              <a:graphicFrameLocks noChangeAspect="1"/>
-            </wp:cNvGraphicFramePr>
-            <a:graphic>
-              <a:graphicData uri="http://schemas.openxmlformats.org/drawingml/2006/picture">
-                <pic:pic>
-                  <pic:nvPicPr>
-                    <pic:cNvPr id="0" name="7c21964156ee4060a3717deb4b5dd622_sello_sello.png"/>
-                    <pic:cNvPicPr/>
-                  </pic:nvPicPr>
-                  <pic:blipFill>
-                    <a:blip r:embed="rId12"/>
-                    <a:stretch>
-                      <a:fillRect/>
-                    </a:stretch>
-                  </pic:blipFill>
-                  <pic:spPr>
-                    <a:xfrm>
-                      <a:off x="0" y="0"/>
-                      <a:ext cx="2286000" cy="2286000"/>
-                    </a:xfrm>
-                    <a:prstGeom prst="rect"/>
-                  </pic:spPr>
-                </pic:pic>
-              </a:graphicData>
-            </a:graphic>
-          </wp:inline>
-        </w:drawing>
-      </w:r>
-    </w:p>
-    <w:p>
-      <w:pPr>
-        <w:ind w:left="0"/>
-      </w:pPr>
-      <w:r>
-        <w:drawing>
-          <wp:inline xmlns:a="http://schemas.openxmlformats.org/drawingml/2006/main">
-            <wp:extent cx="2743200" cy="2743200"/>
-            <wp:docPr id="2" name="Picture 2"/>
-            <wp:cNvGraphicFramePr>
-              <a:graphicFrameLocks noChangeAspect="1"/>
-            </wp:cNvGraphicFramePr>
-            <a:graphic>
-              <a:graphicData uri="http://schemas.openxmlformats.org/drawingml/2006/picture">
-                <pic:pic>
-                  <pic:nvPicPr>
-                    <pic:cNvPr id="0" name="7c21964156ee4060a3717deb4b5dd622_firma_firma.png"/>
-                    <pic:cNvPicPr/>
-                  </pic:nvPicPr>
-                  <pic:blipFill>
-                    <a:blip r:embed="rId13"/>
-                    <a:stretch>
-                      <a:fillRect/>
-                    </a:stretch>
-                  </pic:blipFill>
-                  <pic:spPr>
-                    <a:xfrm>
-                      <a:off x="0" y="0"/>
-                      <a:ext cx="2743200" cy="2743200"/>
-                    </a:xfrm>
-                    <a:prstGeom prst="rect"/>
-                  </pic:spPr>
-                </pic:pic>
-              </a:graphicData>
-            </a:graphic>
-          </wp:inline>
-        </w:drawing>
       </w:r>
     </w:p>
     <w:sectPr>

</xml_diff>